<commit_message>
Admin alerts grouped (portal bell, one digest table, instant email only for emergencies), external down check, encrypted database backup to Cloudflare R2 - weekly and off until switched on, to stay inside Supabase egress (A589, migration 174); 32-bit POS database driver compiled for ia32 and every release gated by opening a real database in both the 64-bit and 32-bit app before anything is published (A590)
</commit_message>
<xml_diff>
--- a/docs/BACKUPS.docx
+++ b/docs/BACKUPS.docx
@@ -15,7 +15,7 @@
         <w:spacing w:after="120"/>
       </w:pPr>
       <w:r>
-        <w:t xml:space="preserve">ZapTill backs up every client's data every night at midnight (00:00 Nairobi), encrypted, into a storage bucket that belongs to you — not to GitHub, and not only to Supabase. This guide covers what is backed up, where it goes, how to set it up once, how to restore a backup, how to test a restore every month, and the outside check that tells you when the server is down. (A589, 2026-10-25.)</w:t>
+        <w:t xml:space="preserve">ZapTill backs up every client's data once a week, at midnight going into Sunday (00:00 Nairobi), encrypted, into a storage bucket that belongs to you — not to GitHub, and not only to Supabase. This guide covers what is backed up, where it goes, how to set it up once, how to restore a backup, how to test a restore every month, and the outside check that tells you when the server is down. (A589, 2026-10-25.)</w:t>
       </w:r>
     </w:p>
     <w:p>
@@ -52,8 +52,8 @@
         </w:tblBorders>
       </w:tblPr>
       <w:tblGrid>
-        <w:gridCol w:w="1524"/>
-        <w:gridCol w:w="8114"/>
+        <w:gridCol w:w="1490"/>
+        <w:gridCol w:w="8148"/>
       </w:tblGrid>
       <w:tr>
         <w:trPr>
@@ -61,7 +61,7 @@
         </w:trPr>
         <w:tc>
           <w:tcPr>
-            <w:tcW w:type="dxa" w:w="1524"/>
+            <w:tcW w:type="dxa" w:w="1490"/>
             <w:tcBorders>
               <w:top w:val="single" w:color="D1D5DB" w:sz="4"/>
               <w:left w:val="single" w:color="D1D5DB" w:sz="4"/>
@@ -80,7 +80,7 @@
         </w:tc>
         <w:tc>
           <w:tcPr>
-            <w:tcW w:type="dxa" w:w="8114"/>
+            <w:tcW w:type="dxa" w:w="8148"/>
             <w:tcBorders>
               <w:top w:val="single" w:color="D1D5DB" w:sz="4"/>
               <w:left w:val="single" w:color="D1D5DB" w:sz="4"/>
@@ -101,7 +101,7 @@
       <w:tr>
         <w:tc>
           <w:tcPr>
-            <w:tcW w:type="dxa" w:w="1524"/>
+            <w:tcW w:type="dxa" w:w="1490"/>
             <w:tcBorders>
               <w:top w:val="single" w:color="D1D5DB" w:sz="4"/>
               <w:left w:val="single" w:color="D1D5DB" w:sz="4"/>
@@ -129,7 +129,7 @@
         </w:tc>
         <w:tc>
           <w:tcPr>
-            <w:tcW w:type="dxa" w:w="8114"/>
+            <w:tcW w:type="dxa" w:w="8148"/>
             <w:tcBorders>
               <w:top w:val="single" w:color="D1D5DB" w:sz="4"/>
               <w:left w:val="single" w:color="D1D5DB" w:sz="4"/>
@@ -205,7 +205,7 @@
       <w:tr>
         <w:tc>
           <w:tcPr>
-            <w:tcW w:type="dxa" w:w="1524"/>
+            <w:tcW w:type="dxa" w:w="1490"/>
             <w:tcBorders>
               <w:top w:val="single" w:color="D1D5DB" w:sz="4"/>
               <w:left w:val="single" w:color="D1D5DB" w:sz="4"/>
@@ -233,27 +233,107 @@
         </w:tc>
         <w:tc>
           <w:tcPr>
-            <w:tcW w:type="dxa" w:w="8114"/>
-            <w:tcBorders>
-              <w:top w:val="single" w:color="D1D5DB" w:sz="4"/>
-              <w:left w:val="single" w:color="D1D5DB" w:sz="4"/>
-              <w:bottom w:val="single" w:color="D1D5DB" w:sz="4"/>
-              <w:right w:val="single" w:color="D1D5DB" w:sz="4"/>
-            </w:tcBorders>
-            <w:tcMar>
-              <w:top w:type="dxa" w:w="60"/>
-              <w:left w:type="dxa" w:w="100"/>
-              <w:bottom w:type="dxa" w:w="60"/>
-              <w:right w:type="dxa" w:w="100"/>
-            </w:tcMar>
-          </w:tcPr>
-          <w:p>
-            <w:r>
-              <w:rPr>
-                <w:sz w:val="19"/>
-                <w:szCs w:val="19"/>
-              </w:rPr>
-              <w:t xml:space="preserve">Every night at 00:00 Nairobi (21:00 UTC). GitHub can start a scheduled job a few minutes late. You can also run it at any time: GitHub › Actions › Nightly backup › Run workflow.</w:t>
+            <w:tcW w:type="dxa" w:w="8148"/>
+            <w:tcBorders>
+              <w:top w:val="single" w:color="D1D5DB" w:sz="4"/>
+              <w:left w:val="single" w:color="D1D5DB" w:sz="4"/>
+              <w:bottom w:val="single" w:color="D1D5DB" w:sz="4"/>
+              <w:right w:val="single" w:color="D1D5DB" w:sz="4"/>
+            </w:tcBorders>
+            <w:tcMar>
+              <w:top w:type="dxa" w:w="60"/>
+              <w:left w:type="dxa" w:w="100"/>
+              <w:bottom w:type="dxa" w:w="60"/>
+              <w:right w:type="dxa" w:w="100"/>
+            </w:tcMar>
+          </w:tcPr>
+          <w:p>
+            <w:r>
+              <w:rPr>
+                <w:sz w:val="19"/>
+                <w:szCs w:val="19"/>
+              </w:rPr>
+              <w:t xml:space="preserve">Weekly: Sunday 00:00 Nairobi (Saturday 21:00 UTC), once you switch the schedule on — GitHub › Settings › Secrets and variables › Actions › </w:t>
+            </w:r>
+            <w:r>
+              <w:rPr>
+                <w:b/>
+                <w:bCs/>
+                <w:sz w:val="19"/>
+                <w:szCs w:val="19"/>
+              </w:rPr>
+              <w:t xml:space="preserve">Variables</w:t>
+            </w:r>
+            <w:r>
+              <w:rPr>
+                <w:sz w:val="19"/>
+                <w:szCs w:val="19"/>
+              </w:rPr>
+              <w:t xml:space="preserve"> › </w:t>
+            </w:r>
+            <w:r>
+              <w:rPr>
+                <w:rFonts w:ascii="Consolas" w:cs="Consolas" w:eastAsia="Consolas" w:hAnsi="Consolas"/>
+                <w:sz w:val="19"/>
+                <w:szCs w:val="19"/>
+                <w:shd w:fill="F3F4F6" w:color="auto" w:val="clear"/>
+              </w:rPr>
+              <w:t xml:space="preserve">BACKUP_SCHEDULE_ENABLED</w:t>
+            </w:r>
+            <w:r>
+              <w:rPr>
+                <w:sz w:val="19"/>
+                <w:szCs w:val="19"/>
+              </w:rPr>
+              <w:t xml:space="preserve"> = </w:t>
+            </w:r>
+            <w:r>
+              <w:rPr>
+                <w:rFonts w:ascii="Consolas" w:cs="Consolas" w:eastAsia="Consolas" w:hAnsi="Consolas"/>
+                <w:sz w:val="19"/>
+                <w:szCs w:val="19"/>
+                <w:shd w:fill="F3F4F6" w:color="auto" w:val="clear"/>
+              </w:rPr>
+              <w:t xml:space="preserve">true</w:t>
+            </w:r>
+            <w:r>
+              <w:rPr>
+                <w:sz w:val="19"/>
+                <w:szCs w:val="19"/>
+              </w:rPr>
+              <w:t xml:space="preserve">. Until then it runs only by hand: GitHub › Actions › Nightly backup › Run workflow. </w:t>
+            </w:r>
+            <w:r>
+              <w:rPr>
+                <w:b/>
+                <w:bCs/>
+                <w:sz w:val="19"/>
+                <w:szCs w:val="19"/>
+              </w:rPr>
+              <w:t xml:space="preserve">Why weekly (A591, 2026-10-26):</w:t>
+            </w:r>
+            <w:r>
+              <w:rPr>
+                <w:sz w:val="19"/>
+                <w:szCs w:val="19"/>
+              </w:rPr>
+              <w:t xml:space="preserve"> every full backup reads the whole database out of Supabase, which counts as egress — the Free plan allows 5 GB a month in all, so a nightly full copy would use it up. Before switching the schedule on, check the database size (Supabase SQL: </w:t>
+            </w:r>
+            <w:r>
+              <w:rPr>
+                <w:rFonts w:ascii="Consolas" w:cs="Consolas" w:eastAsia="Consolas" w:hAnsi="Consolas"/>
+                <w:sz w:val="19"/>
+                <w:szCs w:val="19"/>
+                <w:shd w:fill="F3F4F6" w:color="auto" w:val="clear"/>
+              </w:rPr>
+              <w:t xml:space="preserve">select pg_size_pretty(pg_database_size(current_database()));</w:t>
+            </w:r>
+            <w:r>
+              <w:rPr>
+                <w:sz w:val="19"/>
+                <w:szCs w:val="19"/>
+              </w:rPr>
+              <w:t xml:space="preserve">) — four of those a month must fit the egress budget. On Supabase Pro its own daily backups cover the days between.</w:t>
             </w:r>
           </w:p>
         </w:tc>
@@ -261,7 +341,7 @@
       <w:tr>
         <w:tc>
           <w:tcPr>
-            <w:tcW w:type="dxa" w:w="1524"/>
+            <w:tcW w:type="dxa" w:w="1490"/>
             <w:tcBorders>
               <w:top w:val="single" w:color="D1D5DB" w:sz="4"/>
               <w:left w:val="single" w:color="D1D5DB" w:sz="4"/>
@@ -289,7 +369,7 @@
         </w:tc>
         <w:tc>
           <w:tcPr>
-            <w:tcW w:type="dxa" w:w="8114"/>
+            <w:tcW w:type="dxa" w:w="8148"/>
             <w:tcBorders>
               <w:top w:val="single" w:color="D1D5DB" w:sz="4"/>
               <w:left w:val="single" w:color="D1D5DB" w:sz="4"/>
@@ -358,7 +438,7 @@
       <w:tr>
         <w:tc>
           <w:tcPr>
-            <w:tcW w:type="dxa" w:w="1524"/>
+            <w:tcW w:type="dxa" w:w="1490"/>
             <w:tcBorders>
               <w:top w:val="single" w:color="D1D5DB" w:sz="4"/>
               <w:left w:val="single" w:color="D1D5DB" w:sz="4"/>
@@ -386,7 +466,7 @@
         </w:tc>
         <w:tc>
           <w:tcPr>
-            <w:tcW w:type="dxa" w:w="8114"/>
+            <w:tcW w:type="dxa" w:w="8148"/>
             <w:tcBorders>
               <w:top w:val="single" w:color="D1D5DB" w:sz="4"/>
               <w:left w:val="single" w:color="D1D5DB" w:sz="4"/>
@@ -494,7 +574,7 @@
       <w:tr>
         <w:tc>
           <w:tcPr>
-            <w:tcW w:type="dxa" w:w="1524"/>
+            <w:tcW w:type="dxa" w:w="1490"/>
             <w:tcBorders>
               <w:top w:val="single" w:color="D1D5DB" w:sz="4"/>
               <w:left w:val="single" w:color="D1D5DB" w:sz="4"/>
@@ -522,7 +602,7 @@
         </w:tc>
         <w:tc>
           <w:tcPr>
-            <w:tcW w:type="dxa" w:w="8114"/>
+            <w:tcW w:type="dxa" w:w="8148"/>
             <w:tcBorders>
               <w:top w:val="single" w:color="D1D5DB" w:sz="4"/>
               <w:left w:val="single" w:color="D1D5DB" w:sz="4"/>
@@ -582,7 +662,7 @@
       <w:tr>
         <w:tc>
           <w:tcPr>
-            <w:tcW w:type="dxa" w:w="1524"/>
+            <w:tcW w:type="dxa" w:w="1490"/>
             <w:tcBorders>
               <w:top w:val="single" w:color="D1D5DB" w:sz="4"/>
               <w:left w:val="single" w:color="D1D5DB" w:sz="4"/>
@@ -610,7 +690,7 @@
         </w:tc>
         <w:tc>
           <w:tcPr>
-            <w:tcW w:type="dxa" w:w="8114"/>
+            <w:tcW w:type="dxa" w:w="8148"/>
             <w:tcBorders>
               <w:top w:val="single" w:color="D1D5DB" w:sz="4"/>
               <w:left w:val="single" w:color="D1D5DB" w:sz="4"/>
@@ -1587,10 +1667,10 @@
           <w:b/>
           <w:bCs/>
         </w:rPr>
-        <w:t xml:space="preserve">No backup for 26 hours</w:t>
-      </w:r>
-      <w:r>
-        <w:t xml:space="preserve"> (it failed, or did not run at all): the server's watchdog emails "Backup: no good nightly backup for …". GitHub switches a schedule off after 60 days without a commit to the repository; the Actions tab then says so — enable the workflow again there.</w:t>
+        <w:t xml:space="preserve">No backup for 8 days</w:t>
+      </w:r>
+      <w:r>
+        <w:t xml:space="preserve"> (it failed, or did not run at all — weekly, A591): the server's watchdog emails "Backup: no good backup for …". GitHub switches a schedule off after 60 days without a commit to the repository; the Actions tab then says so — enable the workflow again there.</w:t>
       </w:r>
     </w:p>
     <w:p>

</xml_diff>

<commit_message>
Admin messages restyled (A592): Telegram with a bold headline, plain-word times and link buttons, client problems as two-line rows with what to do, email tables with a What to do column, plain-text fallback; backup: the first run no longer wipes its own work folder (traps act in the main shell only, prune tolerates no monthly folder yet)
</commit_message>
<xml_diff>
--- a/docs/BACKUPS.docx
+++ b/docs/BACKUPS.docx
@@ -1650,7 +1650,7 @@
         <w:t xml:space="preserve">A backup fails:</w:t>
       </w:r>
       <w:r>
-        <w:t xml:space="preserve"> the admin is emailed at once ("ZapTill nightly backup FAILED", and Telegram), it shows red on the admin portal › System and on the bell, and the GitHub run is red. The older backups are untouched — the clean-up only runs after a good backup.</w:t>
+        <w:t xml:space="preserve"> the admin is emailed at once ("🔴 Backup failed · Mon 26 Oct" — the step that failed in plain words, the last good backup, and buttons to the GitHub run and this guide; Telegram too), it shows red on the admin portal › System and on the bell, and the GitHub run is red. The older backups are untouched — the clean-up only runs after a good backup.</w:t>
       </w:r>
     </w:p>
     <w:p>
@@ -2353,7 +2353,7 @@
         <w:spacing w:after="60"/>
       </w:pPr>
       <w:r>
-        <w:t xml:space="preserve">when it goes down: one email and Telegram ("ZapTill PRODUCTION DOWN"), and a GitHub issue "Production down" is opened. While the issue is open you are not told again;</w:t>
+        <w:t xml:space="preserve">when it goes down: one email and Telegram ("🔴 Production down — Mon 26 Oct 13:07 EAT", what is not answering, a button to the run), and a GitHub issue "Production down" is opened. While the issue is open you are not told again;</w:t>
       </w:r>
     </w:p>
     <w:p>

</xml_diff>